<commit_message>
YHAAO-4009 word2pdf gotenberg - update template
</commit_message>
<xml_diff>
--- a/src/src/main/webapp/portal/examine/pccExamineReportTemplate.docx
+++ b/src/src/main/webapp/portal/examine/pccExamineReportTemplate.docx
@@ -6,6 +6,9 @@
     <w:p>
       <w:pPr>
         <w:pStyle w:val="BodyA"/>
+        <w:rPr>
+          <w:rFonts w:hint="eastAsia"/>
+        </w:rPr>
       </w:pPr>
       <w:r>
         <w:rPr>
@@ -52,6 +55,9 @@
       <w:pPr>
         <w:pStyle w:val="BodyA"/>
         <w:jc w:val="center"/>
+        <w:rPr>
+          <w:rFonts w:hint="eastAsia"/>
+        </w:rPr>
       </w:pPr>
     </w:p>
     <w:p>
@@ -71,7 +77,7 @@
         <w:suppressAutoHyphens/>
         <w:outlineLvl w:val="0"/>
         <w:rPr>
-          <w:rFonts w:eastAsia="宋体"/>
+          <w:rFonts w:eastAsia="宋体" w:hint="default"/>
           <w:sz w:val="22"/>
           <w:szCs w:val="22"/>
         </w:rPr>
@@ -81,6 +87,9 @@
       <w:pPr>
         <w:pStyle w:val="BodyA"/>
         <w:jc w:val="center"/>
+        <w:rPr>
+          <w:rFonts w:hint="eastAsia"/>
+        </w:rPr>
       </w:pPr>
     </w:p>
     <w:tbl>
@@ -122,6 +131,9 @@
                 <w:bar w:val="none" w:sz="0" w:color="auto"/>
               </w:pBdr>
               <w:jc w:val="left"/>
+              <w:rPr>
+                <w:rFonts w:hint="eastAsia"/>
+              </w:rPr>
             </w:pPr>
             <w:r>
               <w:rPr>
@@ -186,6 +198,9 @@
                 <w:bar w:val="none" w:sz="0" w:color="auto"/>
               </w:pBdr>
               <w:jc w:val="left"/>
+              <w:rPr>
+                <w:rFonts w:hint="eastAsia"/>
+              </w:rPr>
             </w:pPr>
             <w:r>
               <w:rPr>
@@ -241,6 +256,9 @@
                 <w:bar w:val="none" w:sz="0" w:color="auto"/>
               </w:pBdr>
               <w:jc w:val="left"/>
+              <w:rPr>
+                <w:rFonts w:hint="eastAsia"/>
+              </w:rPr>
             </w:pPr>
             <w:r>
               <w:rPr>
@@ -288,29 +306,102 @@
       <w:pPr>
         <w:pStyle w:val="BodyA"/>
         <w:jc w:val="center"/>
+        <w:rPr>
+          <w:rFonts w:hint="eastAsia"/>
+        </w:rPr>
       </w:pPr>
     </w:p>
     <w:p>
       <w:pPr>
         <w:pStyle w:val="BodyA"/>
         <w:jc w:val="center"/>
+        <w:rPr>
+          <w:rFonts w:hint="eastAsia"/>
+        </w:rPr>
       </w:pPr>
     </w:p>
     <w:p>
-      <w:pPr>
-        <w:pStyle w:val="BodyA"/>
-        <w:jc w:val="center"/>
-      </w:pPr>
+      <w:r>
+        <w:rPr>
+          <w:rFonts w:hint="eastAsia"/>
+        </w:rPr>
+        <w:br w:type="page"/>
+      </w:r>
     </w:p>
     <w:p>
-      <w:pPr>
-        <w:pStyle w:val="BodyA"/>
-        <w:jc w:val="center"/>
-      </w:pPr>
+      <w:r>
+        <w:rPr>
+          <w:noProof/>
+        </w:rPr>
+        <w:lastRenderedPageBreak/>
+        <w:drawing>
+          <wp:anchor distT="0" distB="0" distL="114300" distR="114300" simplePos="0" relativeHeight="251658240" behindDoc="1" locked="0" layoutInCell="1" allowOverlap="1" wp14:anchorId="030C5D19">
+            <wp:simplePos x="0" y="0"/>
+            <wp:positionH relativeFrom="margin">
+              <wp:align>left</wp:align>
+            </wp:positionH>
+            <wp:positionV relativeFrom="paragraph">
+              <wp:posOffset>3810</wp:posOffset>
+            </wp:positionV>
+            <wp:extent cx="5505450" cy="979170"/>
+            <wp:effectExtent l="0" t="0" r="0" b="0"/>
+            <wp:wrapTight wrapText="bothSides">
+              <wp:wrapPolygon edited="0">
+                <wp:start x="0" y="0"/>
+                <wp:lineTo x="0" y="21012"/>
+                <wp:lineTo x="21525" y="21012"/>
+                <wp:lineTo x="21525" y="0"/>
+                <wp:lineTo x="0" y="0"/>
+              </wp:wrapPolygon>
+            </wp:wrapTight>
+            <wp:docPr id="1" name="Picture 1"/>
+            <wp:cNvGraphicFramePr>
+              <a:graphicFrameLocks xmlns:a="http://schemas.openxmlformats.org/drawingml/2006/main" noChangeAspect="1"/>
+            </wp:cNvGraphicFramePr>
+            <a:graphic xmlns:a="http://schemas.openxmlformats.org/drawingml/2006/main">
+              <a:graphicData uri="http://schemas.openxmlformats.org/drawingml/2006/picture">
+                <pic:pic xmlns:pic="http://schemas.openxmlformats.org/drawingml/2006/picture">
+                  <pic:nvPicPr>
+                    <pic:cNvPr id="1" name=""/>
+                    <pic:cNvPicPr/>
+                  </pic:nvPicPr>
+                  <pic:blipFill>
+                    <a:blip r:embed="rId7">
+                      <a:extLst>
+                        <a:ext uri="{28A0092B-C50C-407E-A947-70E740481C1C}">
+                          <a14:useLocalDpi xmlns:a14="http://schemas.microsoft.com/office/drawing/2010/main" val="0"/>
+                        </a:ext>
+                      </a:extLst>
+                    </a:blip>
+                    <a:stretch>
+                      <a:fillRect/>
+                    </a:stretch>
+                  </pic:blipFill>
+                  <pic:spPr>
+                    <a:xfrm>
+                      <a:off x="0" y="0"/>
+                      <a:ext cx="5505450" cy="979170"/>
+                    </a:xfrm>
+                    <a:prstGeom prst="rect">
+                      <a:avLst/>
+                    </a:prstGeom>
+                  </pic:spPr>
+                </pic:pic>
+              </a:graphicData>
+            </a:graphic>
+            <wp14:sizeRelH relativeFrom="page">
+              <wp14:pctWidth>0</wp14:pctWidth>
+            </wp14:sizeRelH>
+            <wp14:sizeRelV relativeFrom="page">
+              <wp14:pctHeight>0</wp14:pctHeight>
+            </wp14:sizeRelV>
+          </wp:anchor>
+        </w:drawing>
+      </w:r>
     </w:p>
     <w:tbl>
       <w:tblPr>
-        <w:tblpPr w:leftFromText="180" w:rightFromText="180" w:horzAnchor="margin" w:tblpY="1935"/>
+        <w:tblpPr w:leftFromText="187" w:rightFromText="187" w:vertAnchor="page" w:horzAnchor="margin" w:tblpY="3331"/>
         <w:tblW w:w="8484" w:type="dxa"/>
         <w:tblBorders>
           <w:top w:val="single" w:sz="8" w:space="0" w:color="FFFFFF"/>
@@ -368,9 +459,10 @@
                 <w:sz w:val="22"/>
                 <w:szCs w:val="22"/>
               </w:rPr>
-              <w:lastRenderedPageBreak/>
               <w:t>探头型号</w:t>
             </w:r>
+            <w:bookmarkStart w:id="0" w:name="_GoBack"/>
+            <w:bookmarkEnd w:id="0"/>
           </w:p>
         </w:tc>
         <w:tc>
@@ -2396,57 +2488,41 @@
     </w:tbl>
     <w:p>
       <w:pPr>
-        <w:pStyle w:val="BodyA"/>
-        <w:ind w:left="108" w:hanging="108"/>
+        <w:rPr>
+          <w:rFonts w:ascii="Helvetica Neue" w:eastAsia="Arial Unicode MS" w:hAnsi="Helvetica Neue" w:cs="Arial Unicode MS" w:hint="eastAsia"/>
+          <w:color w:val="000000"/>
+          <w:kern w:val="2"/>
+          <w:sz w:val="21"/>
+          <w:szCs w:val="21"/>
+          <w:u w:color="000000"/>
+          <w:lang w:val="zh-CN" w:eastAsia="zh-CN"/>
+        </w:rPr>
       </w:pPr>
       <w:r>
         <w:rPr>
-          <w:noProof/>
+          <w:rFonts w:hint="eastAsia"/>
+          <w:lang w:val="zh-CN"/>
         </w:rPr>
-        <w:drawing>
-          <wp:inline distT="0" distB="0" distL="0" distR="0" wp14:anchorId="030C5D19" wp14:editId="6DB02223">
-            <wp:extent cx="5505450" cy="979760"/>
-            <wp:effectExtent l="0" t="0" r="0" b="0"/>
-            <wp:docPr id="1" name="Picture 1"/>
-            <wp:cNvGraphicFramePr>
-              <a:graphicFrameLocks xmlns:a="http://schemas.openxmlformats.org/drawingml/2006/main" noChangeAspect="1"/>
-            </wp:cNvGraphicFramePr>
-            <a:graphic xmlns:a="http://schemas.openxmlformats.org/drawingml/2006/main">
-              <a:graphicData uri="http://schemas.openxmlformats.org/drawingml/2006/picture">
-                <pic:pic xmlns:pic="http://schemas.openxmlformats.org/drawingml/2006/picture">
-                  <pic:nvPicPr>
-                    <pic:cNvPr id="1" name=""/>
-                    <pic:cNvPicPr/>
-                  </pic:nvPicPr>
-                  <pic:blipFill>
-                    <a:blip r:embed="rId7"/>
-                    <a:stretch>
-                      <a:fillRect/>
-                    </a:stretch>
-                  </pic:blipFill>
-                  <pic:spPr>
-                    <a:xfrm>
-                      <a:off x="0" y="0"/>
-                      <a:ext cx="5571459" cy="991507"/>
-                    </a:xfrm>
-                    <a:prstGeom prst="rect">
-                      <a:avLst/>
-                    </a:prstGeom>
-                  </pic:spPr>
-                </pic:pic>
-              </a:graphicData>
-            </a:graphic>
-          </wp:inline>
-        </w:drawing>
+        <w:br w:type="page"/>
       </w:r>
+    </w:p>
+    <w:p>
+      <w:pPr>
+        <w:pStyle w:val="BodyA"/>
+        <w:jc w:val="center"/>
+        <w:rPr>
+          <w:rFonts w:eastAsia="宋体" w:hint="eastAsia"/>
+          <w:lang w:val="zh-CN"/>
+        </w:rPr>
+      </w:pPr>
       <w:r>
         <w:rPr>
           <w:noProof/>
         </w:rPr>
         <w:lastRenderedPageBreak/>
         <w:drawing>
-          <wp:inline distT="0" distB="0" distL="0" distR="0" wp14:anchorId="0CCFF385" wp14:editId="20BDDF21">
-            <wp:extent cx="5270500" cy="937383"/>
+          <wp:inline distT="0" distB="0" distL="0" distR="0" wp14:anchorId="27D953AE" wp14:editId="576C0FB4">
+            <wp:extent cx="5270500" cy="937260"/>
             <wp:effectExtent l="0" t="0" r="6350" b="0"/>
             <wp:docPr id="2" name="Picture 2"/>
             <wp:cNvGraphicFramePr>
@@ -2468,7 +2544,7 @@
                   <pic:spPr>
                     <a:xfrm>
                       <a:off x="0" y="0"/>
-                      <a:ext cx="5270500" cy="937383"/>
+                      <a:ext cx="5270500" cy="937260"/>
                     </a:xfrm>
                     <a:prstGeom prst="rect">
                       <a:avLst/>
@@ -2480,32 +2556,15 @@
           </wp:inline>
         </w:drawing>
       </w:r>
-    </w:p>
-    <w:p>
-      <w:pPr>
-        <w:pStyle w:val="BodyA"/>
-        <w:jc w:val="center"/>
-        <w:rPr>
-          <w:rFonts w:eastAsia="宋体" w:hint="eastAsia"/>
-          <w:lang w:val="zh-CN"/>
-        </w:rPr>
-      </w:pPr>
       <w:r>
         <w:rPr>
           <w:lang w:val="zh-CN"/>
         </w:rPr>
         <w:t>{{@pictureTail}}</w:t>
       </w:r>
-      <w:bookmarkStart w:id="0" w:name="_GoBack"/>
-      <w:bookmarkEnd w:id="0"/>
     </w:p>
     <w:sectPr>
-      <w:headerReference w:type="even" r:id="rId8"/>
-      <w:headerReference w:type="default" r:id="rId9"/>
-      <w:footerReference w:type="even" r:id="rId10"/>
-      <w:footerReference w:type="default" r:id="rId11"/>
-      <w:headerReference w:type="first" r:id="rId12"/>
-      <w:footerReference w:type="first" r:id="rId13"/>
+      <w:footerReference w:type="default" r:id="rId8"/>
       <w:pgSz w:w="11900" w:h="16840"/>
       <w:pgMar w:top="1440" w:right="1800" w:bottom="1440" w:left="1800" w:header="720" w:footer="720" w:gutter="0"/>
       <w:cols w:space="720"/>
@@ -2538,43 +2597,40 @@
   <w:p>
     <w:pPr>
       <w:pStyle w:val="Footer"/>
-    </w:pPr>
-  </w:p>
-</w:ftr>
-</file>
-
-<file path=word/footer2.xml><?xml version="1.0" encoding="utf-8"?>
-<w:ftr xmlns:wpc="http://schemas.microsoft.com/office/word/2010/wordprocessingCanvas" xmlns:cx="http://schemas.microsoft.com/office/drawing/2014/chartex" xmlns:cx1="http://schemas.microsoft.com/office/drawing/2015/9/8/chartex" xmlns:cx2="http://schemas.microsoft.com/office/drawing/2015/10/21/chartex" xmlns:cx3="http://schemas.microsoft.com/office/drawing/2016/5/9/chartex" xmlns:cx4="http://schemas.microsoft.com/office/drawing/2016/5/10/chartex" xmlns:cx5="http://schemas.microsoft.com/office/drawing/2016/5/11/chartex" xmlns:cx6="http://schemas.microsoft.com/office/drawing/2016/5/12/chartex" xmlns:cx7="http://schemas.microsoft.com/office/drawing/2016/5/13/chartex" xmlns:cx8="http://schemas.microsoft.com/office/drawing/2016/5/14/chartex" xmlns:mc="http://schemas.openxmlformats.org/markup-compatibility/2006" xmlns:aink="http://schemas.microsoft.com/office/drawing/2016/ink" xmlns:am3d="http://schemas.microsoft.com/office/drawing/2017/model3d" xmlns:o="urn:schemas-microsoft-com:office:office" xmlns:r="http://schemas.openxmlformats.org/officeDocument/2006/relationships" xmlns:m="http://schemas.openxmlformats.org/officeDocument/2006/math" xmlns:v="urn:schemas-microsoft-com:vml" xmlns:wp14="http://schemas.microsoft.com/office/word/2010/wordprocessingDrawing" xmlns:wp="http://schemas.openxmlformats.org/drawingml/2006/wordprocessingDrawing" xmlns:w10="urn:schemas-microsoft-com:office:word" xmlns:w="http://schemas.openxmlformats.org/wordprocessingml/2006/main" xmlns:w14="http://schemas.microsoft.com/office/word/2010/wordml" xmlns:w15="http://schemas.microsoft.com/office/word/2012/wordml" xmlns:w16cid="http://schemas.microsoft.com/office/word/2016/wordml/cid" xmlns:w16se="http://schemas.microsoft.com/office/word/2015/wordml/symex" xmlns:wpg="http://schemas.microsoft.com/office/word/2010/wordprocessingGroup" xmlns:wpi="http://schemas.microsoft.com/office/word/2010/wordprocessingInk" xmlns:wne="http://schemas.microsoft.com/office/word/2006/wordml" xmlns:wps="http://schemas.microsoft.com/office/word/2010/wordprocessingShape" mc:Ignorable="w14 w15 w16se w16cid wp14">
-  <w:p>
-    <w:pPr>
-      <w:pStyle w:val="Footer"/>
       <w:tabs>
         <w:tab w:val="clear" w:pos="8306"/>
         <w:tab w:val="right" w:pos="8280"/>
       </w:tabs>
       <w:ind w:right="180"/>
       <w:jc w:val="right"/>
+      <w:rPr>
+        <w:rFonts w:hint="eastAsia"/>
+      </w:rPr>
     </w:pPr>
     <w:r>
       <w:rPr>
         <w:noProof/>
       </w:rPr>
-      <w:t xml:space="preserve"> </w:t>
-    </w:r>
-    <w:r>
-      <w:rPr>
-        <w:noProof/>
-      </w:rPr>
-      <w:t xml:space="preserve"> </w:t>
-    </w:r>
-    <w:r>
-      <w:rPr>
-        <w:noProof/>
-      </w:rPr>
       <w:drawing>
-        <wp:inline distT="0" distB="0" distL="0" distR="0" wp14:anchorId="3098B89C" wp14:editId="4967B46F">
+        <wp:anchor distT="0" distB="0" distL="114300" distR="114300" simplePos="0" relativeHeight="251658240" behindDoc="0" locked="0" layoutInCell="1" allowOverlap="1" wp14:anchorId="0C35699F">
+          <wp:simplePos x="0" y="0"/>
+          <wp:positionH relativeFrom="column">
+            <wp:posOffset>-352425</wp:posOffset>
+          </wp:positionH>
+          <wp:positionV relativeFrom="paragraph">
+            <wp:posOffset>-341630</wp:posOffset>
+          </wp:positionV>
           <wp:extent cx="619125" cy="600075"/>
           <wp:effectExtent l="0" t="0" r="9525" b="9525"/>
+          <wp:wrapThrough wrapText="bothSides">
+            <wp:wrapPolygon edited="0">
+              <wp:start x="0" y="0"/>
+              <wp:lineTo x="0" y="21257"/>
+              <wp:lineTo x="21268" y="21257"/>
+              <wp:lineTo x="21268" y="0"/>
+              <wp:lineTo x="0" y="0"/>
+            </wp:wrapPolygon>
+          </wp:wrapThrough>
           <wp:docPr id="4" name="Picture 4"/>
           <wp:cNvGraphicFramePr>
             <a:graphicFrameLocks xmlns:a="http://schemas.openxmlformats.org/drawingml/2006/main" noChangeAspect="1"/>
@@ -2587,7 +2643,13 @@
                   <pic:cNvPicPr/>
                 </pic:nvPicPr>
                 <pic:blipFill>
-                  <a:blip r:embed="rId1"/>
+                  <a:blip r:embed="rId1">
+                    <a:extLst>
+                      <a:ext uri="{28A0092B-C50C-407E-A947-70E740481C1C}">
+                        <a14:useLocalDpi xmlns:a14="http://schemas.microsoft.com/office/drawing/2010/main" val="0"/>
+                      </a:ext>
+                    </a:extLst>
+                  </a:blip>
                   <a:stretch>
                     <a:fillRect/>
                   </a:stretch>
@@ -2604,14 +2666,26 @@
               </pic:pic>
             </a:graphicData>
           </a:graphic>
-        </wp:inline>
+          <wp14:sizeRelH relativeFrom="page">
+            <wp14:pctWidth>0</wp14:pctWidth>
+          </wp14:sizeRelH>
+          <wp14:sizeRelV relativeFrom="page">
+            <wp14:pctHeight>0</wp14:pctHeight>
+          </wp14:sizeRelV>
+        </wp:anchor>
       </w:drawing>
     </w:r>
     <w:r>
       <w:rPr>
         <w:noProof/>
       </w:rPr>
-      <w:t xml:space="preserve">        </w:t>
+      <w:t xml:space="preserve"> </w:t>
+    </w:r>
+    <w:r>
+      <w:rPr>
+        <w:noProof/>
+      </w:rPr>
+      <w:t xml:space="preserve">         </w:t>
     </w:r>
     <w:r>
       <w:rPr>
@@ -2644,16 +2718,6 @@
 </w:ftr>
 </file>
 
-<file path=word/footer3.xml><?xml version="1.0" encoding="utf-8"?>
-<w:ftr xmlns:wpc="http://schemas.microsoft.com/office/word/2010/wordprocessingCanvas" xmlns:cx="http://schemas.microsoft.com/office/drawing/2014/chartex" xmlns:cx1="http://schemas.microsoft.com/office/drawing/2015/9/8/chartex" xmlns:cx2="http://schemas.microsoft.com/office/drawing/2015/10/21/chartex" xmlns:cx3="http://schemas.microsoft.com/office/drawing/2016/5/9/chartex" xmlns:cx4="http://schemas.microsoft.com/office/drawing/2016/5/10/chartex" xmlns:cx5="http://schemas.microsoft.com/office/drawing/2016/5/11/chartex" xmlns:cx6="http://schemas.microsoft.com/office/drawing/2016/5/12/chartex" xmlns:cx7="http://schemas.microsoft.com/office/drawing/2016/5/13/chartex" xmlns:cx8="http://schemas.microsoft.com/office/drawing/2016/5/14/chartex" xmlns:mc="http://schemas.openxmlformats.org/markup-compatibility/2006" xmlns:aink="http://schemas.microsoft.com/office/drawing/2016/ink" xmlns:am3d="http://schemas.microsoft.com/office/drawing/2017/model3d" xmlns:o="urn:schemas-microsoft-com:office:office" xmlns:r="http://schemas.openxmlformats.org/officeDocument/2006/relationships" xmlns:m="http://schemas.openxmlformats.org/officeDocument/2006/math" xmlns:v="urn:schemas-microsoft-com:vml" xmlns:wp14="http://schemas.microsoft.com/office/word/2010/wordprocessingDrawing" xmlns:wp="http://schemas.openxmlformats.org/drawingml/2006/wordprocessingDrawing" xmlns:w10="urn:schemas-microsoft-com:office:word" xmlns:w="http://schemas.openxmlformats.org/wordprocessingml/2006/main" xmlns:w14="http://schemas.microsoft.com/office/word/2010/wordml" xmlns:w15="http://schemas.microsoft.com/office/word/2012/wordml" xmlns:w16cid="http://schemas.microsoft.com/office/word/2016/wordml/cid" xmlns:w16se="http://schemas.microsoft.com/office/word/2015/wordml/symex" xmlns:wpg="http://schemas.microsoft.com/office/word/2010/wordprocessingGroup" xmlns:wpi="http://schemas.microsoft.com/office/word/2010/wordprocessingInk" xmlns:wne="http://schemas.microsoft.com/office/word/2006/wordml" xmlns:wps="http://schemas.microsoft.com/office/word/2010/wordprocessingShape" mc:Ignorable="w14 w15 w16se w16cid wp14">
-  <w:p>
-    <w:pPr>
-      <w:pStyle w:val="Footer"/>
-    </w:pPr>
-  </w:p>
-</w:ftr>
-</file>
-
 <file path=word/footnotes.xml><?xml version="1.0" encoding="utf-8"?>
 <w:footnotes xmlns:wpc="http://schemas.microsoft.com/office/word/2010/wordprocessingCanvas" xmlns:cx="http://schemas.microsoft.com/office/drawing/2014/chartex" xmlns:cx1="http://schemas.microsoft.com/office/drawing/2015/9/8/chartex" xmlns:cx2="http://schemas.microsoft.com/office/drawing/2015/10/21/chartex" xmlns:cx3="http://schemas.microsoft.com/office/drawing/2016/5/9/chartex" xmlns:cx4="http://schemas.microsoft.com/office/drawing/2016/5/10/chartex" xmlns:cx5="http://schemas.microsoft.com/office/drawing/2016/5/11/chartex" xmlns:cx6="http://schemas.microsoft.com/office/drawing/2016/5/12/chartex" xmlns:cx7="http://schemas.microsoft.com/office/drawing/2016/5/13/chartex" xmlns:cx8="http://schemas.microsoft.com/office/drawing/2016/5/14/chartex" xmlns:mc="http://schemas.openxmlformats.org/markup-compatibility/2006" xmlns:aink="http://schemas.microsoft.com/office/drawing/2016/ink" xmlns:am3d="http://schemas.microsoft.com/office/drawing/2017/model3d" xmlns:o="urn:schemas-microsoft-com:office:office" xmlns:r="http://schemas.openxmlformats.org/officeDocument/2006/relationships" xmlns:m="http://schemas.openxmlformats.org/officeDocument/2006/math" xmlns:v="urn:schemas-microsoft-com:vml" xmlns:wp14="http://schemas.microsoft.com/office/word/2010/wordprocessingDrawing" xmlns:wp="http://schemas.openxmlformats.org/drawingml/2006/wordprocessingDrawing" xmlns:w10="urn:schemas-microsoft-com:office:word" xmlns:w="http://schemas.openxmlformats.org/wordprocessingml/2006/main" xmlns:w14="http://schemas.microsoft.com/office/word/2010/wordml" xmlns:w15="http://schemas.microsoft.com/office/word/2012/wordml" xmlns:w16cid="http://schemas.microsoft.com/office/word/2016/wordml/cid" xmlns:w16se="http://schemas.microsoft.com/office/word/2015/wordml/symex" xmlns:wpg="http://schemas.microsoft.com/office/word/2010/wordprocessingGroup" xmlns:wpi="http://schemas.microsoft.com/office/word/2010/wordprocessingInk" xmlns:wne="http://schemas.microsoft.com/office/word/2006/wordml" xmlns:wps="http://schemas.microsoft.com/office/word/2010/wordprocessingShape" mc:Ignorable="w14 w15 w16se w16cid wp14">
   <w:footnote w:type="separator" w:id="-1">
@@ -2671,36 +2735,6 @@
     </w:p>
   </w:footnote>
 </w:footnotes>
-</file>
-
-<file path=word/header1.xml><?xml version="1.0" encoding="utf-8"?>
-<w:hdr xmlns:wpc="http://schemas.microsoft.com/office/word/2010/wordprocessingCanvas" xmlns:cx="http://schemas.microsoft.com/office/drawing/2014/chartex" xmlns:cx1="http://schemas.microsoft.com/office/drawing/2015/9/8/chartex" xmlns:cx2="http://schemas.microsoft.com/office/drawing/2015/10/21/chartex" xmlns:cx3="http://schemas.microsoft.com/office/drawing/2016/5/9/chartex" xmlns:cx4="http://schemas.microsoft.com/office/drawing/2016/5/10/chartex" xmlns:cx5="http://schemas.microsoft.com/office/drawing/2016/5/11/chartex" xmlns:cx6="http://schemas.microsoft.com/office/drawing/2016/5/12/chartex" xmlns:cx7="http://schemas.microsoft.com/office/drawing/2016/5/13/chartex" xmlns:cx8="http://schemas.microsoft.com/office/drawing/2016/5/14/chartex" xmlns:mc="http://schemas.openxmlformats.org/markup-compatibility/2006" xmlns:aink="http://schemas.microsoft.com/office/drawing/2016/ink" xmlns:am3d="http://schemas.microsoft.com/office/drawing/2017/model3d" xmlns:o="urn:schemas-microsoft-com:office:office" xmlns:r="http://schemas.openxmlformats.org/officeDocument/2006/relationships" xmlns:m="http://schemas.openxmlformats.org/officeDocument/2006/math" xmlns:v="urn:schemas-microsoft-com:vml" xmlns:wp14="http://schemas.microsoft.com/office/word/2010/wordprocessingDrawing" xmlns:wp="http://schemas.openxmlformats.org/drawingml/2006/wordprocessingDrawing" xmlns:w10="urn:schemas-microsoft-com:office:word" xmlns:w="http://schemas.openxmlformats.org/wordprocessingml/2006/main" xmlns:w14="http://schemas.microsoft.com/office/word/2010/wordml" xmlns:w15="http://schemas.microsoft.com/office/word/2012/wordml" xmlns:w16cid="http://schemas.microsoft.com/office/word/2016/wordml/cid" xmlns:w16se="http://schemas.microsoft.com/office/word/2015/wordml/symex" xmlns:wpg="http://schemas.microsoft.com/office/word/2010/wordprocessingGroup" xmlns:wpi="http://schemas.microsoft.com/office/word/2010/wordprocessingInk" xmlns:wne="http://schemas.microsoft.com/office/word/2006/wordml" xmlns:wps="http://schemas.microsoft.com/office/word/2010/wordprocessingShape" mc:Ignorable="w14 w15 w16se w16cid wp14">
-  <w:p>
-    <w:pPr>
-      <w:pStyle w:val="Header"/>
-    </w:pPr>
-  </w:p>
-</w:hdr>
-</file>
-
-<file path=word/header2.xml><?xml version="1.0" encoding="utf-8"?>
-<w:hdr xmlns:wpc="http://schemas.microsoft.com/office/word/2010/wordprocessingCanvas" xmlns:cx="http://schemas.microsoft.com/office/drawing/2014/chartex" xmlns:cx1="http://schemas.microsoft.com/office/drawing/2015/9/8/chartex" xmlns:cx2="http://schemas.microsoft.com/office/drawing/2015/10/21/chartex" xmlns:cx3="http://schemas.microsoft.com/office/drawing/2016/5/9/chartex" xmlns:cx4="http://schemas.microsoft.com/office/drawing/2016/5/10/chartex" xmlns:cx5="http://schemas.microsoft.com/office/drawing/2016/5/11/chartex" xmlns:cx6="http://schemas.microsoft.com/office/drawing/2016/5/12/chartex" xmlns:cx7="http://schemas.microsoft.com/office/drawing/2016/5/13/chartex" xmlns:cx8="http://schemas.microsoft.com/office/drawing/2016/5/14/chartex" xmlns:mc="http://schemas.openxmlformats.org/markup-compatibility/2006" xmlns:aink="http://schemas.microsoft.com/office/drawing/2016/ink" xmlns:am3d="http://schemas.microsoft.com/office/drawing/2017/model3d" xmlns:o="urn:schemas-microsoft-com:office:office" xmlns:r="http://schemas.openxmlformats.org/officeDocument/2006/relationships" xmlns:m="http://schemas.openxmlformats.org/officeDocument/2006/math" xmlns:v="urn:schemas-microsoft-com:vml" xmlns:wp14="http://schemas.microsoft.com/office/word/2010/wordprocessingDrawing" xmlns:wp="http://schemas.openxmlformats.org/drawingml/2006/wordprocessingDrawing" xmlns:w10="urn:schemas-microsoft-com:office:word" xmlns:w="http://schemas.openxmlformats.org/wordprocessingml/2006/main" xmlns:w14="http://schemas.microsoft.com/office/word/2010/wordml" xmlns:w15="http://schemas.microsoft.com/office/word/2012/wordml" xmlns:w16cid="http://schemas.microsoft.com/office/word/2016/wordml/cid" xmlns:w16se="http://schemas.microsoft.com/office/word/2015/wordml/symex" xmlns:wpg="http://schemas.microsoft.com/office/word/2010/wordprocessingGroup" xmlns:wpi="http://schemas.microsoft.com/office/word/2010/wordprocessingInk" xmlns:wne="http://schemas.microsoft.com/office/word/2006/wordml" xmlns:wps="http://schemas.microsoft.com/office/word/2010/wordprocessingShape" mc:Ignorable="w14 w15 w16se w16cid wp14">
-  <w:p>
-    <w:pPr>
-      <w:pStyle w:val="Header"/>
-    </w:pPr>
-  </w:p>
-</w:hdr>
-</file>
-
-<file path=word/header3.xml><?xml version="1.0" encoding="utf-8"?>
-<w:hdr xmlns:wpc="http://schemas.microsoft.com/office/word/2010/wordprocessingCanvas" xmlns:cx="http://schemas.microsoft.com/office/drawing/2014/chartex" xmlns:cx1="http://schemas.microsoft.com/office/drawing/2015/9/8/chartex" xmlns:cx2="http://schemas.microsoft.com/office/drawing/2015/10/21/chartex" xmlns:cx3="http://schemas.microsoft.com/office/drawing/2016/5/9/chartex" xmlns:cx4="http://schemas.microsoft.com/office/drawing/2016/5/10/chartex" xmlns:cx5="http://schemas.microsoft.com/office/drawing/2016/5/11/chartex" xmlns:cx6="http://schemas.microsoft.com/office/drawing/2016/5/12/chartex" xmlns:cx7="http://schemas.microsoft.com/office/drawing/2016/5/13/chartex" xmlns:cx8="http://schemas.microsoft.com/office/drawing/2016/5/14/chartex" xmlns:mc="http://schemas.openxmlformats.org/markup-compatibility/2006" xmlns:aink="http://schemas.microsoft.com/office/drawing/2016/ink" xmlns:am3d="http://schemas.microsoft.com/office/drawing/2017/model3d" xmlns:o="urn:schemas-microsoft-com:office:office" xmlns:r="http://schemas.openxmlformats.org/officeDocument/2006/relationships" xmlns:m="http://schemas.openxmlformats.org/officeDocument/2006/math" xmlns:v="urn:schemas-microsoft-com:vml" xmlns:wp14="http://schemas.microsoft.com/office/word/2010/wordprocessingDrawing" xmlns:wp="http://schemas.openxmlformats.org/drawingml/2006/wordprocessingDrawing" xmlns:w10="urn:schemas-microsoft-com:office:word" xmlns:w="http://schemas.openxmlformats.org/wordprocessingml/2006/main" xmlns:w14="http://schemas.microsoft.com/office/word/2010/wordml" xmlns:w15="http://schemas.microsoft.com/office/word/2012/wordml" xmlns:w16cid="http://schemas.microsoft.com/office/word/2016/wordml/cid" xmlns:w16se="http://schemas.microsoft.com/office/word/2015/wordml/symex" xmlns:wpg="http://schemas.microsoft.com/office/word/2010/wordprocessingGroup" xmlns:wpi="http://schemas.microsoft.com/office/word/2010/wordprocessingInk" xmlns:wne="http://schemas.microsoft.com/office/word/2006/wordml" xmlns:wps="http://schemas.microsoft.com/office/word/2010/wordprocessingShape" mc:Ignorable="w14 w15 w16se w16cid wp14">
-  <w:p>
-    <w:pPr>
-      <w:pStyle w:val="Header"/>
-    </w:pPr>
-  </w:p>
-</w:hdr>
 </file>
 
 <file path=word/styles.xml><?xml version="1.0" encoding="utf-8"?>

</xml_diff>